<commit_message>
Add spacing for clarity in work plan document
</commit_message>
<xml_diff>
--- a/work_plan/work_plan.docx
+++ b/work_plan/work_plan.docx
@@ -3519,23 +3519,104 @@
         </w:rPr>
       </w:pPr>
       <w:bookmarkStart w:id="8" w:name="_Hlk231213000"/>
+    </w:p>
+    <w:p>
+      <w:pPr>
+        <w:pStyle w:val="NoSpacing"/>
+        <w:rPr>
+          <w:rStyle w:val="IntenseReference"/>
+          <w:lang w:val="en-US"/>
+        </w:rPr>
+      </w:pPr>
+    </w:p>
+    <w:p>
+      <w:pPr>
+        <w:pStyle w:val="NoSpacing"/>
+        <w:rPr>
+          <w:rStyle w:val="IntenseReference"/>
+          <w:lang w:val="en-US"/>
+        </w:rPr>
+      </w:pPr>
       <w:r>
         <w:rPr>
           <w:rStyle w:val="IntenseReference"/>
           <w:lang w:val="en-US"/>
         </w:rPr>
-        <w:lastRenderedPageBreak/>
         <w:t>GANTT:</w:t>
       </w:r>
       <w:bookmarkEnd w:id="8"/>
     </w:p>
+    <w:p>
+      <w:pPr>
+        <w:pStyle w:val="NoSpacing"/>
+        <w:rPr>
+          <w:rStyle w:val="IntenseReference"/>
+          <w:lang w:val="en-US"/>
+        </w:rPr>
+      </w:pPr>
+      <w:r>
+        <w:rPr>
+          <w:rStyle w:val="IntenseReference"/>
+          <w:lang w:val="en-US"/>
+        </w:rPr>
+        <w:drawing>
+          <wp:anchor distT="0" distB="0" distL="114300" distR="114300" simplePos="0" relativeHeight="251658240" behindDoc="0" locked="0" layoutInCell="1" allowOverlap="1" wp14:anchorId="4C171904" wp14:editId="5A8819F0">
+            <wp:simplePos x="0" y="0"/>
+            <wp:positionH relativeFrom="margin">
+              <wp:align>left</wp:align>
+            </wp:positionH>
+            <wp:positionV relativeFrom="paragraph">
+              <wp:posOffset>195500</wp:posOffset>
+            </wp:positionV>
+            <wp:extent cx="5731510" cy="3102610"/>
+            <wp:effectExtent l="0" t="0" r="2540" b="2540"/>
+            <wp:wrapSquare wrapText="bothSides"/>
+            <wp:docPr id="100930913" name="Picture 1"/>
+            <wp:cNvGraphicFramePr>
+              <a:graphicFrameLocks xmlns:a="http://schemas.openxmlformats.org/drawingml/2006/main" noChangeAspect="1"/>
+            </wp:cNvGraphicFramePr>
+            <a:graphic xmlns:a="http://schemas.openxmlformats.org/drawingml/2006/main">
+              <a:graphicData uri="http://schemas.openxmlformats.org/drawingml/2006/picture">
+                <pic:pic xmlns:pic="http://schemas.openxmlformats.org/drawingml/2006/picture">
+                  <pic:nvPicPr>
+                    <pic:cNvPr id="100930913" name=""/>
+                    <pic:cNvPicPr/>
+                  </pic:nvPicPr>
+                  <pic:blipFill>
+                    <a:blip r:embed="rId8" cstate="print">
+                      <a:extLst>
+                        <a:ext uri="{28A0092B-C50C-407E-A947-70E740481C1C}">
+                          <a14:useLocalDpi xmlns:a14="http://schemas.microsoft.com/office/drawing/2010/main" val="0"/>
+                        </a:ext>
+                      </a:extLst>
+                    </a:blip>
+                    <a:stretch>
+                      <a:fillRect/>
+                    </a:stretch>
+                  </pic:blipFill>
+                  <pic:spPr>
+                    <a:xfrm>
+                      <a:off x="0" y="0"/>
+                      <a:ext cx="5731510" cy="3102610"/>
+                    </a:xfrm>
+                    <a:prstGeom prst="rect">
+                      <a:avLst/>
+                    </a:prstGeom>
+                  </pic:spPr>
+                </pic:pic>
+              </a:graphicData>
+            </a:graphic>
+          </wp:anchor>
+        </w:drawing>
+      </w:r>
+    </w:p>
     <w:sectPr>
-      <w:headerReference w:type="even" r:id="rId8"/>
-      <w:headerReference w:type="default" r:id="rId9"/>
-      <w:footerReference w:type="even" r:id="rId10"/>
-      <w:footerReference w:type="default" r:id="rId11"/>
-      <w:headerReference w:type="first" r:id="rId12"/>
-      <w:footerReference w:type="first" r:id="rId13"/>
+      <w:headerReference w:type="even" r:id="rId9"/>
+      <w:headerReference w:type="default" r:id="rId10"/>
+      <w:footerReference w:type="even" r:id="rId11"/>
+      <w:footerReference w:type="default" r:id="rId12"/>
+      <w:headerReference w:type="first" r:id="rId13"/>
+      <w:footerReference w:type="first" r:id="rId14"/>
       <w:pgSz w:w="11906" w:h="16838"/>
       <w:pgMar w:top="1440" w:right="1440" w:bottom="1440" w:left="1440" w:header="708" w:footer="708" w:gutter="0"/>
       <w:cols w:space="708"/>

</xml_diff>